<commit_message>
docs: update repository link and evidence
</commit_message>
<xml_diff>
--- a/docs/progreso2-integracion-granja-jonathan.docx
+++ b/docs/progreso2-integracion-granja-jonathan.docx
@@ -165,7 +165,7 @@
           </w:tcPr>
           <w:p>
             <w:r>
-              <w:t>https://github.com/jonathangranja/progreso2-integracion-granja-jonathan</w:t>
+              <w:t>https://github.com/Jonalex1804/progreso2-integracion-granja-jonathan</w:t>
             </w:r>
           </w:p>
         </w:tc>
@@ -189,7 +189,7 @@
         <w:spacing w:after="120"/>
       </w:pPr>
       <w:r>
-        <w:t>Repositorio GitHub de la solucion: https://github.com/jonathangranja/progreso2-integracion-granja-jonathan</w:t>
+        <w:t>Repositorio GitHub de la solucion: https://github.com/Jonalex1804/progreso2-integracion-granja-jonathan</w:t>
       </w:r>
     </w:p>
     <w:p>

</xml_diff>